<commit_message>
feat: Add Articles to Study case
</commit_message>
<xml_diff>
--- a/Documentation/DocumentacaoProjeto.DOCX
+++ b/Documentation/DocumentacaoProjeto.DOCX
@@ -97,7 +97,7 @@
           <w:b/>
           <w:szCs w:val="24"/>
         </w:rPr>
-        <w:t>Identificação do Aluno 1</w:t>
+        <w:t>Daniel Marques Da Silva Oliveira Junior</w:t>
       </w:r>
     </w:p>
     <w:p>
@@ -116,7 +116,25 @@
           <w:b/>
           <w:szCs w:val="24"/>
         </w:rPr>
-        <w:t>Identificação do Aluno 2</w:t>
+        <w:t xml:space="preserve">Diana </w:t>
+      </w:r>
+      <w:proofErr w:type="spellStart"/>
+      <w:r>
+        <w:rPr>
+          <w:rFonts w:cs="Arial"/>
+          <w:b/>
+          <w:szCs w:val="24"/>
+        </w:rPr>
+        <w:t>Lys</w:t>
+      </w:r>
+      <w:proofErr w:type="spellEnd"/>
+      <w:r>
+        <w:rPr>
+          <w:rFonts w:cs="Arial"/>
+          <w:b/>
+          <w:szCs w:val="24"/>
+        </w:rPr>
+        <w:t xml:space="preserve"> Batista</w:t>
       </w:r>
     </w:p>
     <w:p>
@@ -135,8 +153,18 @@
           <w:b/>
           <w:szCs w:val="24"/>
         </w:rPr>
-        <w:t>Identificação do Aluno 3</w:t>
-      </w:r>
+        <w:t xml:space="preserve">Francisco Yuri </w:t>
+      </w:r>
+      <w:proofErr w:type="spellStart"/>
+      <w:r>
+        <w:rPr>
+          <w:rFonts w:cs="Arial"/>
+          <w:b/>
+          <w:szCs w:val="24"/>
+        </w:rPr>
+        <w:t>Garbi</w:t>
+      </w:r>
+      <w:proofErr w:type="spellEnd"/>
     </w:p>
     <w:p>
       <w:pPr>
@@ -154,15 +182,7 @@
           <w:b/>
           <w:szCs w:val="24"/>
         </w:rPr>
-        <w:t xml:space="preserve">Identificação do Aluno </w:t>
-      </w:r>
-      <w:r>
-        <w:rPr>
-          <w:rFonts w:cs="Arial"/>
-          <w:b/>
-          <w:szCs w:val="24"/>
-        </w:rPr>
-        <w:t>4</w:t>
+        <w:t>Luan Alves Lisboa</w:t>
       </w:r>
     </w:p>
     <w:p>
@@ -181,15 +201,7 @@
           <w:b/>
           <w:szCs w:val="24"/>
         </w:rPr>
-        <w:t xml:space="preserve">Identificação do Aluno </w:t>
-      </w:r>
-      <w:r>
-        <w:rPr>
-          <w:rFonts w:cs="Arial"/>
-          <w:b/>
-          <w:szCs w:val="24"/>
-        </w:rPr>
-        <w:t>5</w:t>
+        <w:t>Miguel Souza Silva</w:t>
       </w:r>
     </w:p>
     <w:p>
@@ -443,7 +455,7 @@
           <w:szCs w:val="24"/>
         </w:rPr>
         <w:lastRenderedPageBreak/>
-        <w:t>Identificação do Aluno 1</w:t>
+        <w:t>Daniel Marques Da Silva Oliveira Junior</w:t>
       </w:r>
     </w:p>
     <w:p>
@@ -462,7 +474,25 @@
           <w:b/>
           <w:szCs w:val="24"/>
         </w:rPr>
-        <w:t>Identificação do Aluno 2</w:t>
+        <w:t xml:space="preserve">Diana </w:t>
+      </w:r>
+      <w:proofErr w:type="spellStart"/>
+      <w:r>
+        <w:rPr>
+          <w:rFonts w:cs="Arial"/>
+          <w:b/>
+          <w:szCs w:val="24"/>
+        </w:rPr>
+        <w:t>Lys</w:t>
+      </w:r>
+      <w:proofErr w:type="spellEnd"/>
+      <w:r>
+        <w:rPr>
+          <w:rFonts w:cs="Arial"/>
+          <w:b/>
+          <w:szCs w:val="24"/>
+        </w:rPr>
+        <w:t xml:space="preserve"> Batista</w:t>
       </w:r>
     </w:p>
     <w:p>
@@ -481,8 +511,18 @@
           <w:b/>
           <w:szCs w:val="24"/>
         </w:rPr>
-        <w:t>Identificação do Aluno 3</w:t>
-      </w:r>
+        <w:t xml:space="preserve">Francisco Yuri </w:t>
+      </w:r>
+      <w:proofErr w:type="spellStart"/>
+      <w:r>
+        <w:rPr>
+          <w:rFonts w:cs="Arial"/>
+          <w:b/>
+          <w:szCs w:val="24"/>
+        </w:rPr>
+        <w:t>Garbi</w:t>
+      </w:r>
+      <w:proofErr w:type="spellEnd"/>
     </w:p>
     <w:p>
       <w:pPr>
@@ -500,15 +540,7 @@
           <w:b/>
           <w:szCs w:val="24"/>
         </w:rPr>
-        <w:t xml:space="preserve">Identificação do Aluno </w:t>
-      </w:r>
-      <w:r>
-        <w:rPr>
-          <w:rFonts w:cs="Arial"/>
-          <w:b/>
-          <w:szCs w:val="24"/>
-        </w:rPr>
-        <w:t>4</w:t>
+        <w:t>Luan Alves Lisboa</w:t>
       </w:r>
     </w:p>
     <w:p>
@@ -527,15 +559,7 @@
           <w:b/>
           <w:szCs w:val="24"/>
         </w:rPr>
-        <w:t xml:space="preserve">Identificação do Aluno </w:t>
-      </w:r>
-      <w:r>
-        <w:rPr>
-          <w:rFonts w:cs="Arial"/>
-          <w:b/>
-          <w:szCs w:val="24"/>
-        </w:rPr>
-        <w:t>5</w:t>
+        <w:t>Miguel Souza Silva</w:t>
       </w:r>
     </w:p>
     <w:p>
@@ -5575,29 +5599,85 @@
       <w:pPr>
         <w:jc w:val="both"/>
         <w:textAlignment w:val="baseline"/>
-        <w:rPr>
-          <w:u w:val="single"/>
-        </w:rPr>
-      </w:pPr>
-      <w:r>
-        <w:t>-</w:t>
-      </w:r>
-    </w:p>
-    <w:p>
-      <w:pPr>
+      </w:pPr>
+      <w:r>
+        <w:t xml:space="preserve">Inserir preâmbulo do capítulo. </w:t>
+      </w:r>
+      <w:r>
+        <w:t>O preâmbulo de um capítulo do TCC é o parágrafo introdutório que apresenta ao leitor o propósito e a organização daquele capítulo específico, funcionando como uma contextualização interna do trabalho. Ele indica o que será abordado nas seções seguintes, explica a relevância do conteúdo dentro da pesquisa e estabelece a conexão com os objetivos do estudo. Diferentemente da introdução geral do TCC, o preâmbulo é mais breve e direcionado, servindo como um guia que orienta o leitor sobre o foco do capítulo, sua estrutura e sua contribuição para o desenvolvimento da investigação.</w:t>
+      </w:r>
+    </w:p>
+    <w:p>
+      <w:pPr>
+        <w:ind w:firstLine="0"/>
         <w:jc w:val="both"/>
         <w:textAlignment w:val="baseline"/>
       </w:pPr>
-      <w:r>
-        <w:t xml:space="preserve">Inserir preâmbulo do capítulo. </w:t>
-      </w:r>
-      <w:r>
-        <w:t>O preâmbulo de um capítulo do TCC é o parágrafo introdutório que apresenta ao l</w:t>
+      <w:proofErr w:type="gramStart"/>
+      <w:r>
+        <w:t>1  -</w:t>
+      </w:r>
+      <w:proofErr w:type="gramEnd"/>
+      <w:r>
+        <w:t xml:space="preserve"> </w:t>
+      </w:r>
+      <w:r>
+        <w:t>Educação Infantil e Tecnologias Digitais</w:t>
+      </w:r>
+    </w:p>
+    <w:p>
+      <w:pPr>
+        <w:ind w:firstLine="0"/>
+        <w:jc w:val="both"/>
+        <w:textAlignment w:val="baseline"/>
+      </w:pPr>
+      <w:r>
+        <w:tab/>
+        <w:t xml:space="preserve">A Teoria </w:t>
       </w:r>
       <w:bookmarkStart w:id="7" w:name="_GoBack"/>
       <w:bookmarkEnd w:id="7"/>
-      <w:r>
-        <w:t>eitor o propósito e a organização daquele capítulo específico, funcionando como uma contextualização interna do trabalho. Ele indica o que será abordado nas seções seguintes, explica a relevância do conteúdo dentro da pesquisa e estabelece a conexão com os objetivos do estudo. Diferentemente da introdução geral do TCC, o preâmbulo é mais breve e direcionado, servindo como um guia que orienta o leitor sobre o foco do capítulo, sua estrutura e sua contribuição para o desenvolvimento da investigação.</w:t>
+    </w:p>
+    <w:p>
+      <w:pPr>
+        <w:jc w:val="both"/>
+        <w:textAlignment w:val="baseline"/>
+      </w:pPr>
+      <w:r>
+        <w:t>Segundo</w:t>
+      </w:r>
+      <w:r>
+        <w:t xml:space="preserve"> </w:t>
+      </w:r>
+      <w:r>
+        <w:t>Sandro Vinicius Sales dos Santos</w:t>
+      </w:r>
+      <w:r>
+        <w:t xml:space="preserve">: </w:t>
+      </w:r>
+      <w:r>
+        <w:t xml:space="preserve">“[...] </w:t>
+      </w:r>
+      <w:r>
+        <w:t>as crianças são</w:t>
+      </w:r>
+      <w:r>
+        <w:t xml:space="preserve"> </w:t>
+      </w:r>
+      <w:r>
+        <w:t>consideradas seres sociais mergulhados, desde</w:t>
+      </w:r>
+      <w:r>
+        <w:t xml:space="preserve"> </w:t>
+      </w:r>
+      <w:r>
+        <w:t>cedo, em uma rede social já constituída</w:t>
+      </w:r>
+      <w:r>
+        <w:t>[...]</w:t>
+      </w:r>
+      <w:r>
+        <w:t xml:space="preserve">” </w:t>
       </w:r>
     </w:p>
     <w:p>
@@ -5671,11 +5751,8 @@
         <w:textAlignment w:val="baseline"/>
       </w:pPr>
       <w:r>
-        <w:t xml:space="preserve">Na prática, a fundamentação teórica é composta por uma organização lógica de tópicos e subtópicos que tratam dos conceitos centrais do trabalho. Por exemplo, se o tema envolve tecnologia e educação, podem ser discutidos conceitos como </w:t>
-      </w:r>
-      <w:r>
         <w:lastRenderedPageBreak/>
-        <w:t>inovação tecnológica, metodologias ativas, aprendizagem digital e cultura digital. Cada tópico deve apresentar definições, comparações entre autores, convergências e divergências teóricas, sempre com citações adequadas conforme as normas acadêmicas vigentes.</w:t>
+        <w:t>Na prática, a fundamentação teórica é composta por uma organização lógica de tópicos e subtópicos que tratam dos conceitos centrais do trabalho. Por exemplo, se o tema envolve tecnologia e educação, podem ser discutidos conceitos como inovação tecnológica, metodologias ativas, aprendizagem digital e cultura digital. Cada tópico deve apresentar definições, comparações entre autores, convergências e divergências teóricas, sempre com citações adequadas conforme as normas acadêmicas vigentes.</w:t>
       </w:r>
     </w:p>
     <w:p>
@@ -5730,27 +5807,14 @@
       <w:r>
         <w:t xml:space="preserve">Figura </w:t>
       </w:r>
-      <w:r>
-        <w:fldChar w:fldCharType="begin"/>
-      </w:r>
-      <w:r>
-        <w:instrText xml:space="preserve"> SEQ Figura \* ARABIC </w:instrText>
-      </w:r>
-      <w:r>
-        <w:fldChar w:fldCharType="separate"/>
-      </w:r>
-      <w:r>
-        <w:rPr>
-          <w:noProof/>
-        </w:rPr>
-        <w:t>1</w:t>
-      </w:r>
-      <w:r>
-        <w:rPr>
-          <w:noProof/>
-        </w:rPr>
-        <w:fldChar w:fldCharType="end"/>
-      </w:r>
+      <w:fldSimple w:instr=" SEQ Figura \* ARABIC ">
+        <w:r>
+          <w:rPr>
+            <w:noProof/>
+          </w:rPr>
+          <w:t>1</w:t>
+        </w:r>
+      </w:fldSimple>
       <w:r>
         <w:t xml:space="preserve"> - exemplo de figura</w:t>
       </w:r>
@@ -5994,9 +6058,6 @@
       </w:pPr>
       <w:r>
         <w:lastRenderedPageBreak/>
-        <w:t>0</w:t>
-      </w:r>
-      <w:r>
         <w:t>MATERIAIS E MÉTODOS</w:t>
       </w:r>
     </w:p>
@@ -8639,8 +8700,6 @@
     <w:p>
       <w:r>
         <w:br/>
-      </w:r>
-      <w:r>
         <w:t>1. Tópicos – Situação de Pesquisa (Fundamentação Educacional)</w:t>
       </w:r>
     </w:p>
@@ -10919,7 +10978,7 @@
 </file>
 
 <file path=customXml/itemProps1.xml><?xml version="1.0" encoding="utf-8"?>
-<ds:datastoreItem xmlns:ds="http://schemas.openxmlformats.org/officeDocument/2006/customXml" ds:itemID="{53861E56-B0A0-4D20-BB34-E3D6A970170C}">
+<ds:datastoreItem xmlns:ds="http://schemas.openxmlformats.org/officeDocument/2006/customXml" ds:itemID="{C1D63143-CB49-4123-87A3-EFA33E629BD4}">
   <ds:schemaRefs>
     <ds:schemaRef ds:uri="http://schemas.openxmlformats.org/officeDocument/2006/bibliography"/>
   </ds:schemaRefs>

</xml_diff>